<commit_message>
update  notes : java , dmgt, os
</commit_message>
<xml_diff>
--- a/DMGT/notes/Unit-1.docx
+++ b/DMGT/notes/Unit-1.docx
@@ -859,7 +859,21 @@
           <w:sz w:val="20"/>
           <w:szCs w:val="20"/>
         </w:rPr>
-        <w:t>Propositional logic is the study of propositions and logical connectives used to form compound statements whose truth values depend on the truth values of their components.</w:t>
+        <w:t>Propositional logic is the study of propositions and logical connectives used to form compound statements whose truth values depend on the</w:t>
+      </w:r>
+      <w:r>
+        <w:rPr>
+          <w:sz w:val="20"/>
+          <w:szCs w:val="20"/>
+        </w:rPr>
+        <w:t>,</w:t>
+      </w:r>
+      <w:r>
+        <w:rPr>
+          <w:sz w:val="20"/>
+          <w:szCs w:val="20"/>
+        </w:rPr>
+        <w:t xml:space="preserve"> truth values of their components.</w:t>
       </w:r>
     </w:p>
     <w:p>
@@ -7802,7 +7816,7 @@
     <w:p>
       <w:r>
         <w:pict w14:anchorId="5421526B">
-          <v:rect id="_x0000_i1045" style="width:0;height:1.5pt" o:hralign="center" o:hrstd="t" o:hr="t" fillcolor="#a0a0a0" stroked="f"/>
+          <v:rect id="_x0000_i1041" style="width:0;height:1.5pt" o:hralign="center" o:hrstd="t" o:hr="t" fillcolor="#a0a0a0" stroked="f"/>
         </w:pict>
       </w:r>
     </w:p>
@@ -7962,7 +7976,7 @@
     <w:p>
       <w:r>
         <w:pict w14:anchorId="1D63ACB6">
-          <v:rect id="_x0000_i1046" style="width:0;height:1.5pt" o:hralign="center" o:hrstd="t" o:hr="t" fillcolor="#a0a0a0" stroked="f"/>
+          <v:rect id="_x0000_i1042" style="width:0;height:1.5pt" o:hralign="center" o:hrstd="t" o:hr="t" fillcolor="#a0a0a0" stroked="f"/>
         </w:pict>
       </w:r>
     </w:p>
@@ -10523,7 +10537,7 @@
     <w:p>
       <w:r>
         <w:pict w14:anchorId="4970C605">
-          <v:rect id="_x0000_i1048" style="width:0;height:1.5pt" o:hralign="center" o:hrstd="t" o:hr="t" fillcolor="#a0a0a0" stroked="f"/>
+          <v:rect id="_x0000_i1043" style="width:0;height:1.5pt" o:hralign="center" o:hrstd="t" o:hr="t" fillcolor="#a0a0a0" stroked="f"/>
         </w:pict>
       </w:r>
     </w:p>
@@ -10789,7 +10803,7 @@
           <w:szCs w:val="20"/>
         </w:rPr>
         <w:pict w14:anchorId="12512ED9">
-          <v:rect id="_x0000_i1120" style="width:0;height:1.5pt" o:hralign="center" o:hrstd="t" o:hr="t" fillcolor="#a0a0a0" stroked="f"/>
+          <v:rect id="_x0000_i1044" style="width:0;height:1.5pt" o:hralign="center" o:hrstd="t" o:hr="t" fillcolor="#a0a0a0" stroked="f"/>
         </w:pict>
       </w:r>
     </w:p>
@@ -11074,7 +11088,7 @@
           <w:szCs w:val="20"/>
         </w:rPr>
         <w:pict w14:anchorId="4F7EF666">
-          <v:rect id="_x0000_i1121" style="width:0;height:1.5pt" o:hralign="center" o:hrstd="t" o:hr="t" fillcolor="#a0a0a0" stroked="f"/>
+          <v:rect id="_x0000_i1045" style="width:0;height:1.5pt" o:hralign="center" o:hrstd="t" o:hr="t" fillcolor="#a0a0a0" stroked="f"/>
         </w:pict>
       </w:r>
     </w:p>
@@ -11325,7 +11339,7 @@
           <w:szCs w:val="20"/>
         </w:rPr>
         <w:pict w14:anchorId="54BF9067">
-          <v:rect id="_x0000_i1122" style="width:0;height:1.5pt" o:hralign="center" o:hrstd="t" o:hr="t" fillcolor="#a0a0a0" stroked="f"/>
+          <v:rect id="_x0000_i1046" style="width:0;height:1.5pt" o:hralign="center" o:hrstd="t" o:hr="t" fillcolor="#a0a0a0" stroked="f"/>
         </w:pict>
       </w:r>
     </w:p>
@@ -11639,7 +11653,7 @@
           <w:szCs w:val="20"/>
         </w:rPr>
         <w:pict w14:anchorId="5413A818">
-          <v:rect id="_x0000_i1123" style="width:0;height:1.5pt" o:hralign="center" o:hrstd="t" o:hr="t" fillcolor="#a0a0a0" stroked="f"/>
+          <v:rect id="_x0000_i1047" style="width:0;height:1.5pt" o:hralign="center" o:hrstd="t" o:hr="t" fillcolor="#a0a0a0" stroked="f"/>
         </w:pict>
       </w:r>
     </w:p>
@@ -11905,7 +11919,7 @@
           <w:szCs w:val="20"/>
         </w:rPr>
         <w:pict w14:anchorId="1124710C">
-          <v:rect id="_x0000_i1124" style="width:0;height:1.5pt" o:hralign="center" o:hrstd="t" o:hr="t" fillcolor="#a0a0a0" stroked="f"/>
+          <v:rect id="_x0000_i1048" style="width:0;height:1.5pt" o:hralign="center" o:hrstd="t" o:hr="t" fillcolor="#a0a0a0" stroked="f"/>
         </w:pict>
       </w:r>
     </w:p>
@@ -13613,7 +13627,7 @@
           <w:szCs w:val="20"/>
         </w:rPr>
         <w:pict w14:anchorId="40A48EA4">
-          <v:rect id="_x0000_i1127" style="width:0;height:1.5pt" o:hralign="center" o:hrstd="t" o:hr="t" fillcolor="#a0a0a0" stroked="f"/>
+          <v:rect id="_x0000_i1049" style="width:0;height:1.5pt" o:hralign="center" o:hrstd="t" o:hr="t" fillcolor="#a0a0a0" stroked="f"/>
         </w:pict>
       </w:r>
     </w:p>
@@ -14010,7 +14024,7 @@
           <w:szCs w:val="20"/>
         </w:rPr>
         <w:pict w14:anchorId="37993E46">
-          <v:rect id="_x0000_i1129" style="width:0;height:1.5pt" o:hralign="center" o:hrstd="t" o:hr="t" fillcolor="#a0a0a0" stroked="f"/>
+          <v:rect id="_x0000_i1050" style="width:0;height:1.5pt" o:hralign="center" o:hrstd="t" o:hr="t" fillcolor="#a0a0a0" stroked="f"/>
         </w:pict>
       </w:r>
     </w:p>
@@ -14171,17 +14185,7 @@
           <w:szCs w:val="28"/>
           <w:lang w:val="en-US"/>
         </w:rPr>
-        <w:t xml:space="preserve">3. </w:t>
-      </w:r>
-      <w:r>
-        <w:rPr>
-          <w:b/>
-          <w:bCs/>
-          <w:sz w:val="28"/>
-          <w:szCs w:val="28"/>
-          <w:lang w:val="en-US"/>
-        </w:rPr>
-        <w:t>Predicate Logic</w:t>
+        <w:t>3. Predicate Logic</w:t>
       </w:r>
     </w:p>
     <w:p>
@@ -14713,7 +14717,7 @@
           <w:szCs w:val="24"/>
         </w:rPr>
         <w:pict w14:anchorId="3C861108">
-          <v:rect id="_x0000_i1242" style="width:0;height:1.5pt" o:hralign="center" o:hrstd="t" o:hr="t" fillcolor="#a0a0a0" stroked="f"/>
+          <v:rect id="_x0000_i1051" style="width:0;height:1.5pt" o:hralign="center" o:hrstd="t" o:hr="t" fillcolor="#a0a0a0" stroked="f"/>
         </w:pict>
       </w:r>
     </w:p>
@@ -14996,7 +15000,7 @@
           <w:szCs w:val="24"/>
         </w:rPr>
         <w:pict w14:anchorId="2CC1D80F">
-          <v:rect id="_x0000_i1236" style="width:0;height:1.5pt" o:hralign="center" o:hrstd="t" o:hr="t" fillcolor="#a0a0a0" stroked="f"/>
+          <v:rect id="_x0000_i1052" style="width:0;height:1.5pt" o:hralign="center" o:hrstd="t" o:hr="t" fillcolor="#a0a0a0" stroked="f"/>
         </w:pict>
       </w:r>
     </w:p>
@@ -15215,7 +15219,7 @@
           <w:szCs w:val="24"/>
         </w:rPr>
         <w:pict w14:anchorId="238A8DEB">
-          <v:rect id="_x0000_i1237" style="width:0;height:1.5pt" o:hralign="center" o:hrstd="t" o:hr="t" fillcolor="#a0a0a0" stroked="f"/>
+          <v:rect id="_x0000_i1053" style="width:0;height:1.5pt" o:hralign="center" o:hrstd="t" o:hr="t" fillcolor="#a0a0a0" stroked="f"/>
         </w:pict>
       </w:r>
     </w:p>
@@ -15375,7 +15379,7 @@
           <w:szCs w:val="24"/>
         </w:rPr>
         <w:pict w14:anchorId="30B0889C">
-          <v:rect id="_x0000_i1255" style="width:0;height:1.5pt" o:hralign="center" o:hrstd="t" o:hr="t" fillcolor="#a0a0a0" stroked="f"/>
+          <v:rect id="_x0000_i1054" style="width:0;height:1.5pt" o:hralign="center" o:hrstd="t" o:hr="t" fillcolor="#a0a0a0" stroked="f"/>
         </w:pict>
       </w:r>
     </w:p>
@@ -15527,7 +15531,7 @@
           <w:szCs w:val="24"/>
         </w:rPr>
         <w:pict w14:anchorId="7F75995E">
-          <v:rect id="_x0000_i1256" style="width:0;height:1.5pt" o:hralign="center" o:hrstd="t" o:hr="t" fillcolor="#a0a0a0" stroked="f"/>
+          <v:rect id="_x0000_i1055" style="width:0;height:1.5pt" o:hralign="center" o:hrstd="t" o:hr="t" fillcolor="#a0a0a0" stroked="f"/>
         </w:pict>
       </w:r>
     </w:p>
@@ -15809,7 +15813,7 @@
           <w:szCs w:val="24"/>
         </w:rPr>
         <w:pict w14:anchorId="797E0754">
-          <v:rect id="_x0000_i1265" style="width:0;height:1.5pt" o:hralign="center" o:hrstd="t" o:hr="t" fillcolor="#a0a0a0" stroked="f"/>
+          <v:rect id="_x0000_i1056" style="width:0;height:1.5pt" o:hralign="center" o:hrstd="t" o:hr="t" fillcolor="#a0a0a0" stroked="f"/>
         </w:pict>
       </w:r>
     </w:p>
@@ -16416,13 +16420,19 @@
           <w:rPr>
             <w:rStyle w:val="Hyperlink"/>
           </w:rPr>
-          <w:t>https://youtube.com/playlist?list=PLlHzMq48sVguc9X-jdLC764jml0bCJq50&amp;si=z9kXS17xVpNLkbFa</w:t>
+          <w:t>https://youtube.com/playlist?list=PLlHzMq48sVguc9X-jdLC764jml0bCJq50&amp;si=z9</w:t>
         </w:r>
         <w:r>
           <w:rPr>
             <w:rStyle w:val="Hyperlink"/>
           </w:rPr>
-          <w:t>/</w:t>
+          <w:t>k</w:t>
+        </w:r>
+        <w:r>
+          <w:rPr>
+            <w:rStyle w:val="Hyperlink"/>
+          </w:rPr>
+          <w:t>XS17xVpNLkbFa/</w:t>
         </w:r>
       </w:hyperlink>
       <w:r>
@@ -17124,7 +17134,7 @@
           <w:szCs w:val="20"/>
         </w:rPr>
         <w:pict w14:anchorId="4F0C6044">
-          <v:rect id="_x0000_i1348" style="width:0;height:1.5pt" o:hralign="center" o:hrstd="t" o:hr="t" fillcolor="#a0a0a0" stroked="f"/>
+          <v:rect id="_x0000_i1057" style="width:0;height:1.5pt" o:hralign="center" o:hrstd="t" o:hr="t" fillcolor="#a0a0a0" stroked="f"/>
         </w:pict>
       </w:r>
     </w:p>
@@ -17732,7 +17742,7 @@
           <w:szCs w:val="20"/>
         </w:rPr>
         <w:pict w14:anchorId="28D5F290">
-          <v:rect id="_x0000_i1349" style="width:0;height:1.5pt" o:hralign="center" o:hrstd="t" o:hr="t" fillcolor="#a0a0a0" stroked="f"/>
+          <v:rect id="_x0000_i1058" style="width:0;height:1.5pt" o:hralign="center" o:hrstd="t" o:hr="t" fillcolor="#a0a0a0" stroked="f"/>
         </w:pict>
       </w:r>
     </w:p>
@@ -17982,23 +17992,7 @@
           <w:sz w:val="20"/>
           <w:szCs w:val="20"/>
         </w:rPr>
-        <w:t xml:space="preserve">Every student </w:t>
-      </w:r>
-      <w:proofErr w:type="gramStart"/>
-      <w:r>
-        <w:rPr>
-          <w:sz w:val="20"/>
-          <w:szCs w:val="20"/>
-        </w:rPr>
-        <w:t>loves</w:t>
-      </w:r>
-      <w:proofErr w:type="gramEnd"/>
-      <w:r>
-        <w:rPr>
-          <w:sz w:val="20"/>
-          <w:szCs w:val="20"/>
-        </w:rPr>
-        <w:t xml:space="preserve"> someone.</w:t>
+        <w:t>Every student loves someone.</w:t>
       </w:r>
     </w:p>
     <w:p>
@@ -18124,7 +18118,7 @@
           <w:szCs w:val="20"/>
         </w:rPr>
         <w:pict w14:anchorId="32C75156">
-          <v:rect id="_x0000_i1350" style="width:0;height:1.5pt" o:hralign="center" o:hrstd="t" o:hr="t" fillcolor="#a0a0a0" stroked="f"/>
+          <v:rect id="_x0000_i1059" style="width:0;height:1.5pt" o:hralign="center" o:hrstd="t" o:hr="t" fillcolor="#a0a0a0" stroked="f"/>
         </w:pict>
       </w:r>
     </w:p>
@@ -23644,6 +23638,7 @@
   <w:style w:type="character" w:default="1" w:styleId="DefaultParagraphFont">
     <w:name w:val="Default Paragraph Font"/>
     <w:uiPriority w:val="1"/>
+    <w:semiHidden/>
     <w:unhideWhenUsed/>
   </w:style>
   <w:style w:type="table" w:default="1" w:styleId="TableNormal">

</xml_diff>